<commit_message>
inicié el retro del parcial 2_7
</commit_message>
<xml_diff>
--- a/3_paciales/2_parcial/parcial_2_7.docx
+++ b/3_paciales/2_parcial/parcial_2_7.docx
@@ -3,12 +3,46 @@
 <w:document xmlns:wpc="http://schemas.microsoft.com/office/word/2010/wordprocessingCanvas" xmlns:cx="http://schemas.microsoft.com/office/drawing/2014/chartex" xmlns:cx1="http://schemas.microsoft.com/office/drawing/2015/9/8/chartex" xmlns:cx2="http://schemas.microsoft.com/office/drawing/2015/10/21/chartex" xmlns:cx3="http://schemas.microsoft.com/office/drawing/2016/5/9/chartex" xmlns:cx4="http://schemas.microsoft.com/office/drawing/2016/5/10/chartex" xmlns:cx5="http://schemas.microsoft.com/office/drawing/2016/5/11/chartex" xmlns:cx6="http://schemas.microsoft.com/office/drawing/2016/5/12/chartex" xmlns:cx7="http://schemas.microsoft.com/office/drawing/2016/5/13/chartex" xmlns:cx8="http://schemas.microsoft.com/office/drawing/2016/5/14/chartex" xmlns:mc="http://schemas.openxmlformats.org/markup-compatibility/2006" xmlns:aink="http://schemas.microsoft.com/office/drawing/2016/ink" xmlns:am3d="http://schemas.microsoft.com/office/drawing/2017/model3d" xmlns:o="urn:schemas-microsoft-com:office:office" xmlns:oel="http://schemas.microsoft.com/office/2019/extlst" xmlns:r="http://schemas.openxmlformats.org/officeDocument/2006/relationships" xmlns:m="http://schemas.openxmlformats.org/officeDocument/2006/math" xmlns:v="urn:schemas-microsoft-com:vml" xmlns:wp14="http://schemas.microsoft.com/office/word/2010/wordprocessingDrawing" xmlns:wp="http://schemas.openxmlformats.org/drawingml/2006/wordprocessingDrawing" xmlns:w10="urn:schemas-microsoft-com:office:word" xmlns:w="http://schemas.openxmlformats.org/wordprocessingml/2006/main" xmlns:w14="http://schemas.microsoft.com/office/word/2010/wordml" xmlns:w15="http://schemas.microsoft.com/office/word/2012/wordml" xmlns:w16cex="http://schemas.microsoft.com/office/word/2018/wordml/cex" xmlns:w16cid="http://schemas.microsoft.com/office/word/2016/wordml/cid" xmlns:w16="http://schemas.microsoft.com/office/word/2018/wordml" xmlns:w16du="http://schemas.microsoft.com/office/word/2023/wordml/word16du" xmlns:w16sdtdh="http://schemas.microsoft.com/office/word/2020/wordml/sdtdatahash" xmlns:w16sdtfl="http://schemas.microsoft.com/office/word/2024/wordml/sdtformatlock" xmlns:w16se="http://schemas.microsoft.com/office/word/2015/wordml/symex" xmlns:wpg="http://schemas.microsoft.com/office/word/2010/wordprocessingGroup" xmlns:wpi="http://schemas.microsoft.com/office/word/2010/wordprocessingInk" xmlns:wne="http://schemas.microsoft.com/office/word/2006/wordml" xmlns:wps="http://schemas.microsoft.com/office/word/2010/wordprocessingShape" mc:Ignorable="w14 w15 w16se w16cid w16 w16cex w16sdtdh w16sdtfl w16du wp14">
   <w:body>
     <w:p>
-      <w:r>
-        <w:t xml:space="preserve">Parcial 2. 16 de abril de 2026. </w:t>
-      </w:r>
-    </w:p>
-    <w:p>
-      <w:r>
+      <w:pPr>
+        <w:rPr>
+          <w:b/>
+          <w:bCs/>
+        </w:rPr>
+      </w:pPr>
+      <w:r>
+        <w:rPr>
+          <w:b/>
+          <w:bCs/>
+        </w:rPr>
+        <w:t xml:space="preserve">Parcial 2. </w:t>
+      </w:r>
+      <w:r>
+        <w:rPr>
+          <w:b/>
+          <w:bCs/>
+        </w:rPr>
+        <w:t xml:space="preserve">  Abril 24 Viernes</w:t>
+      </w:r>
+      <w:r>
+        <w:rPr>
+          <w:b/>
+          <w:bCs/>
+        </w:rPr>
+        <w:t xml:space="preserve"> de 2026. </w:t>
+      </w:r>
+    </w:p>
+    <w:p>
+      <w:pPr>
+        <w:rPr>
+          <w:b/>
+          <w:bCs/>
+        </w:rPr>
+      </w:pPr>
+      <w:r>
+        <w:rPr>
+          <w:b/>
+          <w:bCs/>
+        </w:rPr>
         <w:t xml:space="preserve">Nombre del estudiante:   </w:t>
       </w:r>
     </w:p>
@@ -16,7 +50,7 @@
     <w:p>
       <w:r>
         <w:pict w14:anchorId="7310E5EB">
-          <v:rect id="_x0000_i1073" style="width:0;height:1.5pt" o:hralign="center" o:hrstd="t" o:hrnoshade="t" o:hr="t" fillcolor="gray" stroked="f"/>
+          <v:rect id="_x0000_i1025" style="width:0;height:1.5pt" o:hralign="center" o:hrstd="t" o:hrnoshade="t" o:hr="t" fillcolor="gray" stroked="f"/>
         </w:pict>
       </w:r>
     </w:p>
@@ -62,7 +96,7 @@
     <w:p>
       <w:r>
         <w:pict w14:anchorId="6A516FC4">
-          <v:rect id="_x0000_i1074" style="width:0;height:1.5pt" o:hralign="center" o:hrstd="t" o:hrnoshade="t" o:hr="t" fillcolor="gray" stroked="f"/>
+          <v:rect id="_x0000_i1026" style="width:0;height:1.5pt" o:hralign="center" o:hrstd="t" o:hrnoshade="t" o:hr="t" fillcolor="gray" stroked="f"/>
         </w:pict>
       </w:r>
     </w:p>
@@ -106,7 +140,7 @@
     <w:p>
       <w:r>
         <w:pict w14:anchorId="513994BC">
-          <v:rect id="_x0000_i1075" style="width:0;height:1.5pt" o:hralign="center" o:hrstd="t" o:hrnoshade="t" o:hr="t" fillcolor="gray" stroked="f"/>
+          <v:rect id="_x0000_i1027" style="width:0;height:1.5pt" o:hralign="center" o:hrstd="t" o:hrnoshade="t" o:hr="t" fillcolor="gray" stroked="f"/>
         </w:pict>
       </w:r>
     </w:p>
@@ -196,39 +230,7 @@
           <w:b/>
           <w:bCs/>
         </w:rPr>
-        <w:t xml:space="preserve">D2 = (x - </w:t>
-      </w:r>
-      <w:proofErr w:type="gramStart"/>
-      <w:r>
-        <w:rPr>
-          <w:b/>
-          <w:bCs/>
-        </w:rPr>
-        <w:t>h)^</w:t>
-      </w:r>
-      <w:proofErr w:type="gramEnd"/>
-      <w:r>
-        <w:rPr>
-          <w:b/>
-          <w:bCs/>
-        </w:rPr>
-        <w:t xml:space="preserve">2 + (y - </w:t>
-      </w:r>
-      <w:proofErr w:type="gramStart"/>
-      <w:r>
-        <w:rPr>
-          <w:b/>
-          <w:bCs/>
-        </w:rPr>
-        <w:t>k)^</w:t>
-      </w:r>
-      <w:proofErr w:type="gramEnd"/>
-      <w:r>
-        <w:rPr>
-          <w:b/>
-          <w:bCs/>
-        </w:rPr>
-        <w:t>2</w:t>
+        <w:t>D2 = (x - h)^2 + (y - k)^2</w:t>
       </w:r>
       <w:r>
         <w:t>.</w:t>
@@ -299,7 +301,7 @@
     <w:p>
       <w:r>
         <w:pict w14:anchorId="290BC4AB">
-          <v:rect id="_x0000_i1076" style="width:0;height:1.5pt" o:hralign="center" o:hrstd="t" o:hrnoshade="t" o:hr="t" fillcolor="gray" stroked="f"/>
+          <v:rect id="_x0000_i1028" style="width:0;height:1.5pt" o:hralign="center" o:hrstd="t" o:hrnoshade="t" o:hr="t" fillcolor="gray" stroked="f"/>
         </w:pict>
       </w:r>
     </w:p>
@@ -465,13 +467,7 @@
         <w:t>Imprima el valor aproximado de la raíz (que debería acercarse a raíz de 2).</w:t>
       </w:r>
     </w:p>
-    <w:p>
-      <w:r>
-        <w:pict w14:anchorId="43849BD4">
-          <v:rect id="_x0000_i1077" style="width:0;height:1.5pt" o:hralign="center" o:hrstd="t" o:hrnoshade="t" o:hr="t" fillcolor="gray" stroked="f"/>
-        </w:pict>
-      </w:r>
-    </w:p>
+    <w:p/>
     <w:p>
       <w:pPr>
         <w:rPr>
@@ -735,7 +731,7 @@
     <w:p>
       <w:r>
         <w:pict w14:anchorId="515AE756">
-          <v:rect id="_x0000_i1078" style="width:0;height:1.5pt" o:hralign="center" o:hrstd="t" o:hrnoshade="t" o:hr="t" fillcolor="gray" stroked="f"/>
+          <v:rect id="_x0000_i1030" style="width:0;height:1.5pt" o:hralign="center" o:hrstd="t" o:hrnoshade="t" o:hr="t" fillcolor="gray" stroked="f"/>
         </w:pict>
       </w:r>
     </w:p>
@@ -1026,7 +1022,7 @@
     <w:p>
       <w:r>
         <w:pict w14:anchorId="2769A77C">
-          <v:rect id="_x0000_i1079" style="width:0;height:1.5pt" o:hralign="center" o:hrstd="t" o:hrnoshade="t" o:hr="t" fillcolor="gray" stroked="f"/>
+          <v:rect id="_x0000_i1031" style="width:0;height:1.5pt" o:hralign="center" o:hrstd="t" o:hrnoshade="t" o:hr="t" fillcolor="gray" stroked="f"/>
         </w:pict>
       </w:r>
     </w:p>
@@ -1199,23 +1195,7 @@
           <w:b/>
           <w:bCs/>
         </w:rPr>
-        <w:t>f'(x) ≈ (</w:t>
-      </w:r>
-      <w:proofErr w:type="gramStart"/>
-      <w:r>
-        <w:rPr>
-          <w:b/>
-          <w:bCs/>
-        </w:rPr>
-        <w:t>f(</w:t>
-      </w:r>
-      <w:proofErr w:type="gramEnd"/>
-      <w:r>
-        <w:rPr>
-          <w:b/>
-          <w:bCs/>
-        </w:rPr>
-        <w:t>x + h) - f(x)) / h</w:t>
+        <w:t>f'(x) ≈ (f(x + h) - f(x)) / h</w:t>
       </w:r>
       <w:r>
         <w:t>.</w:t>
@@ -1237,15 +1217,7 @@
           <w:b/>
           <w:bCs/>
         </w:rPr>
-        <w:t>derivada_en_</w:t>
-      </w:r>
-      <w:proofErr w:type="gramStart"/>
-      <w:r>
-        <w:rPr>
-          <w:b/>
-          <w:bCs/>
-        </w:rPr>
-        <w:t>punto</w:t>
+        <w:t>derivada_en_punto</w:t>
       </w:r>
       <w:proofErr w:type="spellEnd"/>
       <w:r>
@@ -1253,15 +1225,7 @@
           <w:b/>
           <w:bCs/>
         </w:rPr>
-        <w:t>(</w:t>
-      </w:r>
-      <w:proofErr w:type="gramEnd"/>
-      <w:r>
-        <w:rPr>
-          <w:b/>
-          <w:bCs/>
-        </w:rPr>
-        <w:t>x, h)</w:t>
+        <w:t>(x, h)</w:t>
       </w:r>
       <w:r>
         <w:t>.</w:t>
@@ -1333,7 +1297,7 @@
     <w:p>
       <w:r>
         <w:pict w14:anchorId="1B4B0057">
-          <v:rect id="_x0000_i1080" style="width:0;height:1.5pt" o:hralign="center" o:hrstd="t" o:hrnoshade="t" o:hr="t" fillcolor="gray" stroked="f"/>
+          <v:rect id="_x0000_i1032" style="width:0;height:1.5pt" o:hralign="center" o:hrstd="t" o:hrnoshade="t" o:hr="t" fillcolor="gray" stroked="f"/>
         </w:pict>
       </w:r>
     </w:p>
@@ -2698,6 +2662,7 @@
   <w:style w:type="character" w:default="1" w:styleId="Fuentedeprrafopredeter">
     <w:name w:val="Default Paragraph Font"/>
     <w:uiPriority w:val="1"/>
+    <w:semiHidden/>
     <w:unhideWhenUsed/>
   </w:style>
   <w:style w:type="table" w:default="1" w:styleId="Tablanormal">

</xml_diff>